<commit_message>
docs: added directory structure diagram
</commit_message>
<xml_diff>
--- a/docs/Final_Project_Report.docx
+++ b/docs/Final_Project_Report.docx
@@ -176,15 +176,7 @@
         </w:numPr>
       </w:pPr>
       <w:r>
-        <w:t xml:space="preserve">View all student applications </w:t>
-      </w:r>
-      <w:proofErr w:type="gramStart"/>
-      <w:r>
-        <w:t>in</w:t>
-      </w:r>
-      <w:proofErr w:type="gramEnd"/>
-      <w:r>
-        <w:t xml:space="preserve"> a summary table.</w:t>
+        <w:t>View all student applications in a summary table.</w:t>
       </w:r>
     </w:p>
     <w:p>
@@ -380,55 +372,45 @@
       <w:r>
         <w:t>The application uses a page based architecture. Each PHP page includes a database connection file. The system uses header and footer files for the visual layout. The system uses PDO to run SQL queries.</w:t>
       </w:r>
-    </w:p>
-    <w:p>
-      <w:r>
-        <w:t>scholarship_system/</w:t>
-      </w:r>
       <w:r>
         <w:br/>
-        <w:t xml:space="preserve">  config/db.php</w:t>
-      </w:r>
-      <w:r>
-        <w:br/>
-        <w:t xml:space="preserve">  includes/header.php</w:t>
-      </w:r>
-      <w:r>
-        <w:br/>
-        <w:t xml:space="preserve">  includes/footer.php</w:t>
-      </w:r>
-      <w:r>
-        <w:br/>
-      </w:r>
-      <w:r>
-        <w:t xml:space="preserve">  public/css/style.css</w:t>
-      </w:r>
-      <w:r>
-        <w:br/>
-        <w:t xml:space="preserve">  public/login.php</w:t>
-      </w:r>
-      <w:r>
-        <w:br/>
-        <w:t xml:space="preserve">  public/signup.php</w:t>
-      </w:r>
-      <w:r>
-        <w:br/>
-        <w:t xml:space="preserve">  public/home.php</w:t>
-      </w:r>
-      <w:r>
-        <w:br/>
-        <w:t xml:space="preserve">  public/admin.php</w:t>
-      </w:r>
-      <w:r>
-        <w:br/>
-        <w:t xml:space="preserve">  public/applications.php</w:t>
-      </w:r>
-      <w:r>
-        <w:br/>
-        <w:t xml:space="preserve">  schema.sql</w:t>
-      </w:r>
-      <w:r>
-        <w:br/>
+      </w:r>
+      <w:r>
+        <w:drawing>
+          <wp:inline distT="0" distB="0" distL="0" distR="0" wp14:anchorId="2DA2FB47" wp14:editId="608EA969">
+            <wp:extent cx="2880610" cy="3696020"/>
+            <wp:effectExtent l="0" t="0" r="0" b="0"/>
+            <wp:docPr id="1619085148" name="Picture 1"/>
+            <wp:cNvGraphicFramePr>
+              <a:graphicFrameLocks xmlns:a="http://schemas.openxmlformats.org/drawingml/2006/main" noChangeAspect="1"/>
+            </wp:cNvGraphicFramePr>
+            <a:graphic xmlns:a="http://schemas.openxmlformats.org/drawingml/2006/main">
+              <a:graphicData uri="http://schemas.openxmlformats.org/drawingml/2006/picture">
+                <pic:pic xmlns:pic="http://schemas.openxmlformats.org/drawingml/2006/picture">
+                  <pic:nvPicPr>
+                    <pic:cNvPr id="1619085148" name=""/>
+                    <pic:cNvPicPr/>
+                  </pic:nvPicPr>
+                  <pic:blipFill>
+                    <a:blip r:embed="rId8"/>
+                    <a:stretch>
+                      <a:fillRect/>
+                    </a:stretch>
+                  </pic:blipFill>
+                  <pic:spPr>
+                    <a:xfrm>
+                      <a:off x="0" y="0"/>
+                      <a:ext cx="2880610" cy="3696020"/>
+                    </a:xfrm>
+                    <a:prstGeom prst="rect">
+                      <a:avLst/>
+                    </a:prstGeom>
+                  </pic:spPr>
+                </pic:pic>
+              </a:graphicData>
+            </a:graphic>
+          </wp:inline>
+        </w:drawing>
       </w:r>
     </w:p>
     <w:p>
@@ -523,6 +505,7 @@
         </w:numPr>
       </w:pPr>
       <w:r>
+        <w:lastRenderedPageBreak/>
         <w:t>A scholarship can have many applications. We use a foreign key from student_scholarships to scholarships.</w:t>
       </w:r>
     </w:p>
@@ -543,7 +526,6 @@
         <w:pStyle w:val="Heading1"/>
       </w:pPr>
       <w:r>
-        <w:lastRenderedPageBreak/>
         <w:t>7. Main Functional Modules</w:t>
       </w:r>
     </w:p>
@@ -644,15 +626,7 @@
         </w:numPr>
       </w:pPr>
       <w:r>
-        <w:t xml:space="preserve">Copy the project folder to the </w:t>
-      </w:r>
-      <w:proofErr w:type="spellStart"/>
-      <w:r>
-        <w:t>htdocs</w:t>
-      </w:r>
-      <w:proofErr w:type="spellEnd"/>
-      <w:r>
-        <w:t xml:space="preserve"> directory.</w:t>
+        <w:t>Copy the project folder to the htdocs directory.</w:t>
       </w:r>
     </w:p>
     <w:p>
@@ -664,15 +638,7 @@
         </w:numPr>
       </w:pPr>
       <w:r>
-        <w:t xml:space="preserve">Import </w:t>
-      </w:r>
-      <w:proofErr w:type="spellStart"/>
-      <w:r>
-        <w:t>schema.sql</w:t>
-      </w:r>
-      <w:proofErr w:type="spellEnd"/>
-      <w:r>
-        <w:t xml:space="preserve"> into MySQL to create the database.</w:t>
+        <w:t>Import schema.sql into MySQL to create the database.</w:t>
       </w:r>
     </w:p>
     <w:p>
@@ -692,10 +658,7 @@
         <w:pStyle w:val="Heading1"/>
       </w:pPr>
       <w:r>
-        <w:t>1</w:t>
-      </w:r>
-      <w:r>
-        <w:t>0. Testing Summary</w:t>
+        <w:t>10. Testing Summary</w:t>
       </w:r>
     </w:p>
     <w:p>
@@ -751,6 +714,7 @@
         <w:pStyle w:val="Heading1"/>
       </w:pPr>
       <w:r>
+        <w:lastRenderedPageBreak/>
         <w:t>1</w:t>
       </w:r>
       <w:r>
@@ -770,7 +734,6 @@
         <w:pStyle w:val="Heading1"/>
       </w:pPr>
       <w:r>
-        <w:lastRenderedPageBreak/>
         <w:t>Appendix: Complete SQL Queries</w:t>
       </w:r>
     </w:p>
@@ -794,27 +757,11 @@
       </w:r>
       <w:r>
         <w:br/>
-        <w:t xml:space="preserve">CREATE DATABASE IF NOT EXISTS </w:t>
-      </w:r>
-      <w:proofErr w:type="spellStart"/>
-      <w:r>
-        <w:t>scholarship_db</w:t>
-      </w:r>
-      <w:proofErr w:type="spellEnd"/>
-      <w:r>
-        <w:t>;</w:t>
+        <w:t>CREATE DATABASE IF NOT EXISTS scholarship_db;</w:t>
       </w:r>
       <w:r>
         <w:br/>
-        <w:t xml:space="preserve">USE </w:t>
-      </w:r>
-      <w:proofErr w:type="spellStart"/>
-      <w:r>
-        <w:t>scholarship_db</w:t>
-      </w:r>
-      <w:proofErr w:type="spellEnd"/>
-      <w:r>
-        <w:t>;</w:t>
+        <w:t>USE scholarship_db;</w:t>
       </w:r>
       <w:r>
         <w:br/>
@@ -829,8 +776,6 @@
       </w:r>
       <w:r>
         <w:br/>
-      </w:r>
-      <w:r>
         <w:t xml:space="preserve">    username VARCHAR(50) UNIQUE NOT NULL,</w:t>
       </w:r>
       <w:r>
@@ -847,15 +792,7 @@
       </w:r>
       <w:r>
         <w:br/>
-        <w:t xml:space="preserve">    </w:t>
-      </w:r>
-      <w:proofErr w:type="spellStart"/>
-      <w:r>
-        <w:t>created_at</w:t>
-      </w:r>
-      <w:proofErr w:type="spellEnd"/>
-      <w:r>
-        <w:t xml:space="preserve"> TIMESTAMP DEFAULT CURRENT_TIMESTAMP</w:t>
+        <w:t xml:space="preserve">    created_at TIMESTAMP DEFAULT CURRENT_TIMESTAMP</w:t>
       </w:r>
       <w:r>
         <w:br/>
@@ -886,15 +823,7 @@
       </w:r>
       <w:r>
         <w:br/>
-        <w:t xml:space="preserve">    </w:t>
-      </w:r>
-      <w:proofErr w:type="spellStart"/>
-      <w:r>
-        <w:t>created_at</w:t>
-      </w:r>
-      <w:proofErr w:type="spellEnd"/>
-      <w:r>
-        <w:t xml:space="preserve"> TIMESTAMP DEFAULT CURRENT_TIMESTAMP</w:t>
+        <w:t xml:space="preserve">    created_at TIMESTAMP DEFAULT CURRENT_TIMESTAMP</w:t>
       </w:r>
       <w:r>
         <w:br/>
@@ -905,65 +834,23 @@
       </w:r>
       <w:r>
         <w:br/>
-        <w:t xml:space="preserve">CREATE TABLE IF NOT EXISTS </w:t>
-      </w:r>
-      <w:proofErr w:type="spellStart"/>
-      <w:r>
-        <w:t>student_scholarships</w:t>
-      </w:r>
-      <w:proofErr w:type="spellEnd"/>
-      <w:r>
-        <w:t xml:space="preserve"> (</w:t>
+        <w:t>CREATE TABLE IF NOT EXISTS student_scholarships (</w:t>
       </w:r>
       <w:r>
         <w:br/>
-        <w:t xml:space="preserve">    </w:t>
-      </w:r>
-      <w:proofErr w:type="spellStart"/>
-      <w:r>
-        <w:t>student_id</w:t>
-      </w:r>
-      <w:proofErr w:type="spellEnd"/>
-      <w:r>
-        <w:t xml:space="preserve"> INT NOT NULL,</w:t>
+        <w:t xml:space="preserve">    student_id INT NOT NULL,</w:t>
       </w:r>
       <w:r>
         <w:br/>
-      </w:r>
-      <w:r>
-        <w:t xml:space="preserve">    </w:t>
-      </w:r>
-      <w:proofErr w:type="spellStart"/>
-      <w:r>
-        <w:t>scholarship_id</w:t>
-      </w:r>
-      <w:proofErr w:type="spellEnd"/>
-      <w:r>
-        <w:t xml:space="preserve"> INT NOT NULL,</w:t>
+        <w:t xml:space="preserve">    scholarship_id INT NOT NULL,</w:t>
       </w:r>
       <w:r>
         <w:br/>
-        <w:t xml:space="preserve">    </w:t>
-      </w:r>
-      <w:proofErr w:type="spellStart"/>
-      <w:r>
-        <w:t>parents_income</w:t>
-      </w:r>
-      <w:proofErr w:type="spellEnd"/>
-      <w:r>
-        <w:t xml:space="preserve"> FLOAT,</w:t>
+        <w:t xml:space="preserve">    parents_income FLOAT,</w:t>
       </w:r>
       <w:r>
         <w:br/>
-        <w:t xml:space="preserve">    </w:t>
-      </w:r>
-      <w:proofErr w:type="spellStart"/>
-      <w:r>
-        <w:t>parents_occupation</w:t>
-      </w:r>
-      <w:proofErr w:type="spellEnd"/>
-      <w:r>
-        <w:t xml:space="preserve"> VARCHAR(150),</w:t>
+        <w:t xml:space="preserve">    parents_occupation VARCHAR(150),</w:t>
       </w:r>
       <w:r>
         <w:br/>
@@ -971,27 +858,11 @@
       </w:r>
       <w:r>
         <w:br/>
-        <w:t xml:space="preserve">    </w:t>
-      </w:r>
-      <w:proofErr w:type="spellStart"/>
-      <w:r>
-        <w:t>gpa</w:t>
-      </w:r>
-      <w:proofErr w:type="spellEnd"/>
-      <w:r>
-        <w:t xml:space="preserve"> FLOAT,</w:t>
+        <w:t xml:space="preserve">    gpa FLOAT,</w:t>
       </w:r>
       <w:r>
         <w:br/>
-        <w:t xml:space="preserve">    </w:t>
-      </w:r>
-      <w:proofErr w:type="spellStart"/>
-      <w:r>
-        <w:t>permanent_address</w:t>
-      </w:r>
-      <w:proofErr w:type="spellEnd"/>
-      <w:r>
-        <w:t xml:space="preserve"> TEXT,</w:t>
+        <w:t xml:space="preserve">    permanent_address TEXT,</w:t>
       </w:r>
       <w:r>
         <w:br/>
@@ -999,15 +870,7 @@
       </w:r>
       <w:r>
         <w:br/>
-        <w:t xml:space="preserve">    </w:t>
-      </w:r>
-      <w:proofErr w:type="spellStart"/>
-      <w:r>
-        <w:t>contact_numbers</w:t>
-      </w:r>
-      <w:proofErr w:type="spellEnd"/>
-      <w:r>
-        <w:t xml:space="preserve"> VARCHAR(50),</w:t>
+        <w:t xml:space="preserve">    contact_numbers VARCHAR(50),</w:t>
       </w:r>
       <w:r>
         <w:br/>
@@ -1015,15 +878,7 @@
       </w:r>
       <w:r>
         <w:br/>
-        <w:t xml:space="preserve">    </w:t>
-      </w:r>
-      <w:proofErr w:type="spellStart"/>
-      <w:r>
-        <w:t>testimonial_checked</w:t>
-      </w:r>
-      <w:proofErr w:type="spellEnd"/>
-      <w:r>
-        <w:t xml:space="preserve"> INT DEFAULT 0,</w:t>
+        <w:t xml:space="preserve">    testimonial_checked INT DEFAULT 0,</w:t>
       </w:r>
       <w:r>
         <w:br/>
@@ -1031,61 +886,22 @@
       </w:r>
       <w:r>
         <w:br/>
-        <w:t xml:space="preserve">    </w:t>
-      </w:r>
-      <w:proofErr w:type="spellStart"/>
-      <w:r>
-        <w:t>applied_at</w:t>
-      </w:r>
-      <w:proofErr w:type="spellEnd"/>
-      <w:r>
-        <w:t xml:space="preserve"> TIMESTAMP DEFAULT CURRENT_TIMESTAMP,</w:t>
+        <w:t xml:space="preserve">    applied_at TIMESTAMP DEFAULT CURRENT_TIMESTAMP,</w:t>
       </w:r>
       <w:r>
         <w:br/>
-        <w:t xml:space="preserve">    PRIMARY KEY (</w:t>
-      </w:r>
-      <w:proofErr w:type="spellStart"/>
-      <w:r>
-        <w:t>student_id</w:t>
-      </w:r>
-      <w:proofErr w:type="spellEnd"/>
-      <w:r>
-        <w:t xml:space="preserve">, </w:t>
-      </w:r>
-      <w:proofErr w:type="spellStart"/>
-      <w:r>
-        <w:t>scholarship_id</w:t>
-      </w:r>
-      <w:proofErr w:type="spellEnd"/>
-      <w:r>
-        <w:t>),</w:t>
+      </w:r>
+      <w:r>
+        <w:lastRenderedPageBreak/>
+        <w:t xml:space="preserve">    PRIMARY KEY (student_id, scholarship_id),</w:t>
       </w:r>
       <w:r>
         <w:br/>
-        <w:t xml:space="preserve">    FOREIGN KEY (</w:t>
-      </w:r>
-      <w:proofErr w:type="spellStart"/>
-      <w:r>
-        <w:t>student_id</w:t>
-      </w:r>
-      <w:proofErr w:type="spellEnd"/>
-      <w:r>
-        <w:t>) REFERENCES users(id) ON DELETE CASCADE,</w:t>
+        <w:t xml:space="preserve">    FOREIGN KEY (student_id) REFERENCES users(id) ON DELETE CASCADE,</w:t>
       </w:r>
       <w:r>
         <w:br/>
-      </w:r>
-      <w:r>
-        <w:t xml:space="preserve">    FOREIGN KEY (</w:t>
-      </w:r>
-      <w:proofErr w:type="spellStart"/>
-      <w:r>
-        <w:t>scholarship_id</w:t>
-      </w:r>
-      <w:proofErr w:type="spellEnd"/>
-      <w:r>
-        <w:t>) REFERENCES scholarships(id) ON DELETE CASCADE</w:t>
+        <w:t xml:space="preserve">    FOREIGN KEY (scholarship_id) REFERENCES scholarships(id) ON DELETE CASCADE</w:t>
       </w:r>
       <w:r>
         <w:br/>
@@ -1104,26 +920,7 @@
           <w:i/>
           <w:iCs/>
         </w:rPr>
-        <w:lastRenderedPageBreak/>
-        <w:t>-</w:t>
-      </w:r>
-      <w:r>
-        <w:rPr>
-          <w:b/>
-          <w:bCs/>
-          <w:i/>
-          <w:iCs/>
-        </w:rPr>
-        <w:t>-</w:t>
-      </w:r>
-      <w:r>
-        <w:rPr>
-          <w:b/>
-          <w:bCs/>
-          <w:i/>
-          <w:iCs/>
-        </w:rPr>
-        <w:t xml:space="preserve"> Default Users</w:t>
+        <w:t>-- Default Users</w:t>
       </w:r>
       <w:r>
         <w:br/>
@@ -1162,8 +959,6 @@
       </w:r>
       <w:r>
         <w:br/>
-      </w:r>
-      <w:r>
         <w:t>('Academic Excellence Award', 'For students with a GPA of 3.5 or above. Covers tuition fees for one academic year.', '2026-12-31'),</w:t>
       </w:r>
       <w:r>
@@ -1191,15 +986,7 @@
       </w:r>
       <w:r>
         <w:br/>
-        <w:t xml:space="preserve">SELECT * FROM users WHERE username </w:t>
-      </w:r>
-      <w:proofErr w:type="gramStart"/>
-      <w:r>
-        <w:t>= ?</w:t>
-      </w:r>
-      <w:proofErr w:type="gramEnd"/>
-      <w:r>
-        <w:t xml:space="preserve"> AND password = ?;</w:t>
+        <w:t>SELECT * FROM users WHERE username = ? AND password = ?;</w:t>
       </w:r>
       <w:r>
         <w:br/>
@@ -1301,9 +1088,11 @@
       </w:r>
       <w:r>
         <w:br/>
-      </w:r>
-      <w:r>
-        <w:t>SELECT ss.*, u.username, u.email, st.full_name, st.name_with_initials, st.dob, st.gender, st.parents_income, st.parents_occupation, st.gpa, st.permanent_address, st.nic, st.contact_numbers, s.name AS scholarship_name FROM student_scholarships ss INNER JOIN users u ON ss.student_id = u.id LEFT JOIN students st ON u.id = st.user_id INNER JOIN scholarships s ON ss.scholarship_id = s.id ORDER BY ss.applied_at DESC;</w:t>
+        <w:t xml:space="preserve">SELECT ss.*, u.username, u.email, st.full_name, st.name_with_initials, st.dob, st.gender, st.parents_income, st.parents_occupation, st.gpa, st.permanent_address, st.nic, </w:t>
+      </w:r>
+      <w:r>
+        <w:lastRenderedPageBreak/>
+        <w:t>st.contact_numbers, s.name AS scholarship_name FROM student_scholarships ss INNER JOIN users u ON ss.student_id = u.id LEFT JOIN students st ON u.id = st.user_id INNER JOIN scholarships s ON ss.scholarship_id = s.id ORDER BY ss.applied_at DESC;</w:t>
       </w:r>
       <w:r>
         <w:br/>
@@ -1321,13 +1110,10 @@
           <w:i/>
           <w:iCs/>
         </w:rPr>
-        <w:lastRenderedPageBreak/>
         <w:t>-- Admin Actions (admin.php)</w:t>
       </w:r>
       <w:r>
         <w:br/>
-      </w:r>
-      <w:r>
         <w:t>INSERT INTO users (username, password, email, role) VALUES (?, ?, ?, ?);</w:t>
       </w:r>
       <w:r>
@@ -1359,8 +1145,8 @@
       </w:r>
     </w:p>
     <w:sectPr>
-      <w:footerReference w:type="default" r:id="rId8"/>
-      <w:headerReference w:type="first" r:id="rId9"/>
+      <w:footerReference w:type="default" r:id="rId9"/>
+      <w:headerReference w:type="first" r:id="rId10"/>
       <w:pgSz w:w="12240" w:h="15840"/>
       <w:pgMar w:top="1440" w:right="1800" w:bottom="1440" w:left="1800" w:header="720" w:footer="720" w:gutter="0"/>
       <w:cols w:space="720"/>
@@ -3670,6 +3456,7 @@
   <w:style w:type="character" w:default="1" w:styleId="DefaultParagraphFont">
     <w:name w:val="Default Paragraph Font"/>
     <w:uiPriority w:val="1"/>
+    <w:semiHidden/>
     <w:unhideWhenUsed/>
   </w:style>
   <w:style w:type="table" w:default="1" w:styleId="TableNormal">

</xml_diff>